<commit_message>
Rewrite the motivation letter against DAAD's published content list
The applicant supplied the DAAD's own guidance, which asks for three things
the previous version omitted: language skills, what the applicant expects
from the scholarship as distinct from the degree, and personal
characteristics and interests.

The scholarship paragraph is the substantive addition. It states plainly
that the year would otherwise require a loan the applicant would take
anyway, which turns a funding request into evidence of commitment, and
gives the reason he believes the year is worth it.

Co-Authored-By: Claude Opus 5 <noreply@anthropic.com>
Claude-Session: https://claude.ai/code/session_018EEFYAf6pBJaMga5G9Xzjo
</commit_message>
<xml_diff>
--- a/DAAD_Bewerbung/04_Dokumente/Motivationsschreiben_Tim_Roesch.docx
+++ b/DAAD_Bewerbung/04_Dokumente/Motivationsschreiben_Tim_Roesch.docx
@@ -4,235 +4,262 @@
   <w:body>
     <w:p>
       <w:pPr>
-        <w:spacing w:after="60" w:line="264"/>
-        <w:jc w:val="left"/>
+        <w:spacing w:after="0" w:line="264"/>
+      </w:pPr>
+      <w:r>
+        <w:rPr>
+          <w:rFonts w:ascii="Calibri" w:cs="Calibri" w:eastAsia="Calibri" w:hAnsi="Calibri"/>
+          <w:sz w:val="22"/>
+          <w:szCs w:val="22"/>
+        </w:rPr>
+        <w:t xml:space="preserve">Tim Rösch</w:t>
+      </w:r>
+    </w:p>
+    <w:p>
+      <w:pPr>
+        <w:spacing w:after="0" w:line="264"/>
+      </w:pPr>
+      <w:r>
+        <w:rPr>
+          <w:rFonts w:ascii="Calibri" w:cs="Calibri" w:eastAsia="Calibri" w:hAnsi="Calibri"/>
+          <w:sz w:val="22"/>
+          <w:szCs w:val="22"/>
+          <w:highlight w:val="yellow"/>
+          <w:highlightCs w:val="yellow"/>
+        </w:rPr>
+        <w:t xml:space="preserve">[Straße und Hausnummer]</w:t>
+      </w:r>
+    </w:p>
+    <w:p>
+      <w:pPr>
+        <w:spacing w:after="0" w:line="264"/>
+      </w:pPr>
+      <w:r>
+        <w:rPr>
+          <w:rFonts w:ascii="Calibri" w:cs="Calibri" w:eastAsia="Calibri" w:hAnsi="Calibri"/>
+          <w:sz w:val="22"/>
+          <w:szCs w:val="22"/>
+          <w:highlight w:val="yellow"/>
+          <w:highlightCs w:val="yellow"/>
+        </w:rPr>
+        <w:t xml:space="preserve">[Postleitzahl]</w:t>
+      </w:r>
+      <w:r>
+        <w:rPr>
+          <w:rFonts w:ascii="Calibri" w:cs="Calibri" w:eastAsia="Calibri" w:hAnsi="Calibri"/>
+          <w:sz w:val="22"/>
+          <w:szCs w:val="22"/>
+        </w:rPr>
+        <w:t xml:space="preserve"> Stuttgart</w:t>
+      </w:r>
+    </w:p>
+    <w:p>
+      <w:pPr>
+        <w:spacing w:after="0" w:line="264"/>
+      </w:pPr>
+      <w:r>
+        <w:rPr>
+          <w:rFonts w:ascii="Calibri" w:cs="Calibri" w:eastAsia="Calibri" w:hAnsi="Calibri"/>
+          <w:sz w:val="22"/>
+          <w:szCs w:val="22"/>
+        </w:rPr>
+        <w:t xml:space="preserve">tim.roeschkh@gmail.com</w:t>
+      </w:r>
+    </w:p>
+    <w:p>
+      <w:pPr>
+        <w:spacing w:after="300" w:line="264"/>
+      </w:pPr>
+      <w:r>
+        <w:rPr>
+          <w:rFonts w:ascii="Calibri" w:cs="Calibri" w:eastAsia="Calibri" w:hAnsi="Calibri"/>
+          <w:sz w:val="22"/>
+          <w:szCs w:val="22"/>
+        </w:rPr>
+        <w:t xml:space="preserve">+49 176 47299077</w:t>
+      </w:r>
+    </w:p>
+    <w:p>
+      <w:pPr>
+        <w:spacing w:after="300" w:line="264"/>
+        <w:jc w:val="right"/>
+      </w:pPr>
+      <w:r>
+        <w:rPr>
+          <w:rFonts w:ascii="Calibri" w:cs="Calibri" w:eastAsia="Calibri" w:hAnsi="Calibri"/>
+          <w:sz w:val="22"/>
+          <w:szCs w:val="22"/>
+        </w:rPr>
+        <w:t xml:space="preserve">Stuttgart, </w:t>
+      </w:r>
+      <w:r>
+        <w:rPr>
+          <w:rFonts w:ascii="Calibri" w:cs="Calibri" w:eastAsia="Calibri" w:hAnsi="Calibri"/>
+          <w:sz w:val="22"/>
+          <w:szCs w:val="22"/>
+          <w:highlight w:val="yellow"/>
+          <w:highlightCs w:val="yellow"/>
+        </w:rPr>
+        <w:t xml:space="preserve">[Datum]</w:t>
+      </w:r>
+    </w:p>
+    <w:p>
+      <w:pPr>
+        <w:spacing w:after="260" w:line="264"/>
       </w:pPr>
       <w:r>
         <w:rPr>
           <w:rFonts w:ascii="Calibri" w:cs="Calibri" w:eastAsia="Calibri" w:hAnsi="Calibri"/>
           <w:b/>
           <w:bCs/>
-          <w:color w:val="1F3864"/>
-          <w:sz w:val="32"/>
-          <w:szCs w:val="32"/>
-        </w:rPr>
-        <w:t xml:space="preserve">Tim Rösch</w:t>
+          <w:sz w:val="22"/>
+          <w:szCs w:val="22"/>
+        </w:rPr>
+        <w:t xml:space="preserve">Bewerbung um ein Stipendium im Programm „Stipendien für ein Masterstudium im Ausland“: MPhil in Industrial Systems, Manufacture and Management, Institute for Manufacturing, Department of Engineering, University of Cambridge, Studienbeginn Oktober 2027</w:t>
+      </w:r>
+    </w:p>
+    <w:p>
+      <w:pPr>
+        <w:spacing w:after="170" w:line="264"/>
+        <w:jc w:val="both"/>
+      </w:pPr>
+      <w:r>
+        <w:rPr>
+          <w:rFonts w:ascii="Calibri" w:cs="Calibri" w:eastAsia="Calibri" w:hAnsi="Calibri"/>
+          <w:sz w:val="22"/>
+          <w:szCs w:val="22"/>
+        </w:rPr>
+        <w:t xml:space="preserve">Sehr geehrte Damen und Herren,</w:t>
+      </w:r>
+    </w:p>
+    <w:p>
+      <w:pPr>
+        <w:spacing w:after="170" w:line="264"/>
+        <w:jc w:val="both"/>
+      </w:pPr>
+      <w:r>
+        <w:rPr>
+          <w:rFonts w:ascii="Calibri" w:cs="Calibri" w:eastAsia="Calibri" w:hAnsi="Calibri"/>
+          <w:sz w:val="22"/>
+          <w:szCs w:val="22"/>
+        </w:rPr>
+        <w:t xml:space="preserve">ich bewerbe mich um ein Stipendium für den MPhil in Industrial Systems, Manufacture and Management an der University of Cambridge. Mein Bachelorstudium der Wirtschaftsinformatik an der Dualen Hochschule Baden-Württemberg schließe ich in diesem Monat im sechsten Fachsemester ab. Es war ein duales Studium: Auf jede Theoriephase folgte eine Vollzeitphase bei EY-Parthenon, wo ich in sechs Projektphasen überwiegend für industrielle Klienten gearbeitet habe, schwerpunktmäßig in der Automobilbranche. Rund die Hälfte meines Studiums fand auf Englisch statt, dazu kamen vier Semester Wirtschaftsenglisch und drei Monate Projektarbeit in Singapur, wo ich ausschließlich auf Englisch gearbeitet und präsentiert habe. Was ich fachlich mitbringe, liegt bei Daten und Modellen: quantitative Analyse, Programmierung, die Gestaltung betrieblicher Abläufe.</w:t>
+      </w:r>
+    </w:p>
+    <w:p>
+      <w:pPr>
+        <w:spacing w:after="170" w:line="264"/>
+        <w:jc w:val="both"/>
+      </w:pPr>
+      <w:r>
+        <w:rPr>
+          <w:rFonts w:ascii="Calibri" w:cs="Calibri" w:eastAsia="Calibri" w:hAnsi="Calibri"/>
+          <w:sz w:val="22"/>
+          <w:szCs w:val="22"/>
+        </w:rPr>
+        <w:t xml:space="preserve">Drei Jahre lang habe ich Fertigungsunternehmen beurteilt, ohne je zu verstehen, wie in ihnen produziert wird. Was eine Anlage kostet und was sie einbringen muss, kann ich ausrechnen. Ob sie das Richtige tut, kann ich nicht beurteilen. Genau das will ich ändern.</w:t>
+      </w:r>
+    </w:p>
+    <w:p>
+      <w:pPr>
+        <w:spacing w:after="170" w:line="264"/>
+        <w:jc w:val="both"/>
+      </w:pPr>
+      <w:r>
+        <w:rPr>
+          <w:rFonts w:ascii="Calibri" w:cs="Calibri" w:eastAsia="Calibri" w:hAnsi="Calibri"/>
+          <w:sz w:val="22"/>
+          <w:szCs w:val="22"/>
+        </w:rPr>
+        <w:t xml:space="preserve">Wie ich zu dieser Frage gekommen bin, zeigt sich an einer Sache am besten. In der Unternehmensprüfung gehört es zur Arbeit, jede Aussage eines Berichts gegen ihre Quelle zu halten. Das geschieht von Hand, oft spät abends, und die Konzentration lässt genau dann nach, wenn sie gebraucht wird. Ich habe angefangen, dafür ein Prüfverfahren zu bauen, zuerst neben dem Projekt her, später als Abschlussarbeit. Der schwierige Teil war nicht das Modell. Schwierig war die Frage, wann man einem maschinell erzeugten Urteil trauen darf, denn ein Werkzeug, das Fehler übersieht, ist schlechter als keines. Ich habe das Verfahren an 139 Aussagen eines vollständigen Berichts gegengeprüft; die Bewertungsgenauigkeit lag bei 94 Prozent. Damit habe ich drei Partner als Unterstützer gewonnen, und die Teams verwenden es heute in ihrem Arbeitsablauf.</w:t>
+      </w:r>
+    </w:p>
+    <w:p>
+      <w:pPr>
+        <w:spacing w:after="170" w:line="264"/>
+        <w:jc w:val="both"/>
+      </w:pPr>
+      <w:r>
+        <w:rPr>
+          <w:rFonts w:ascii="Calibri" w:cs="Calibri" w:eastAsia="Calibri" w:hAnsi="Calibri"/>
+          <w:sz w:val="22"/>
+          <w:szCs w:val="22"/>
+        </w:rPr>
+        <w:t xml:space="preserve">Wie weit ich von der anderen Seite entfernt bin, habe ich in Böblingen gemerkt. Bei einer Werksführung von Mercedes-Benz standen wir vor einer Fertigung, die nach Angaben unserer Gastgeber zu rund 98 Prozent automatisiert ist. Ich konnte kaum eine der Fragen beantworten, die mir dabei selbst kamen: warum ein Arbeitsschritt automatisiert ist und der nächste nicht, was die Taktzeit begrenzt, woran eine Anlage erkennt, dass ein Teil in Ordnung ist. Im Anschluss habe ich einen Vortrag über Robotik in der Produktion gehalten und mich zum ersten Mal ernsthaft damit befasst, wie solche Systeme aufgebaut sind. In Singapur, wo ich vor Führungskräften einen Anwendungsfall zur vorausschauenden Instandhaltung vertreten habe, ist mir dieselbe Grenze ein zweites Mal begegnet. Den wirtschaftlichen Wert konnte ich beziffern. Das Verfahren dahinter nicht.</w:t>
+      </w:r>
+    </w:p>
+    <w:p>
+      <w:pPr>
+        <w:spacing w:after="170" w:line="264"/>
+        <w:jc w:val="both"/>
+      </w:pPr>
+      <w:r>
+        <w:rPr>
+          <w:rFonts w:ascii="Calibri" w:cs="Calibri" w:eastAsia="Calibri" w:hAnsi="Calibri"/>
+          <w:sz w:val="22"/>
+          <w:szCs w:val="22"/>
+        </w:rPr>
+        <w:t xml:space="preserve">Der MPhil führt zusammen, was ich bisher getrennt gelernt habe: Fertigungsverfahren, Operations und Lieferkette sowie die Modellierung von Fertigungsdaten stehen dort in einem einzigen Jahr nebeneinander, gekoppelt an Unternehmensprojekte und eine eigene Forschungsarbeit. Ein Programm, das mir beide Seiten in einem Jahr zusammenbringt, habe ich in Deutschland nicht gefunden. Allgemeine Managementprogramme habe ich ebenfalls geprüft und verworfen; sie hätten mir hinzugefügt, was ich nach drei Jahren Beratung ohnehin kann, und die Lücke gelassen, die mich einschränkt.</w:t>
+      </w:r>
+    </w:p>
+    <w:p>
+      <w:pPr>
+        <w:spacing w:after="170" w:line="264"/>
+        <w:jc w:val="both"/>
+      </w:pPr>
+      <w:r>
+        <w:rPr>
+          <w:rFonts w:ascii="Calibri" w:cs="Calibri" w:eastAsia="Calibri" w:hAnsi="Calibri"/>
+          <w:sz w:val="22"/>
+          <w:szCs w:val="22"/>
+        </w:rPr>
+        <w:t xml:space="preserve">Ohne Förderung wäre dieses Studium für mich nicht ohne Weiteres finanzierbar. Ich müsste einen Kredit aufnehmen, und ich würde es tun, weil ich diesen Weg gehen will. Das Stipendium ändert etwas anderes: Es macht aus einer finanziellen Entscheidung wieder eine fachliche. Ich könnte das Jahr dafür verwenden, wofür es gedacht ist, statt nebenher zu rechnen. Dass sich dieses Jahr lohnt, lässt sich schwer in Zahlen fassen, aber ich bin davon überzeugt, und der Grund ist einfach: Menschen wachsen an ihrem Umfeld. Am Institute for Manufacturing unterrichten Leute, die in ihrem Fach selbst forschen, und die Studierenden kommen aus anderen Ländern und anderen Disziplinen und stellen Fragen, auf die ich allein nicht käme. Von solchen Menschen will ich lernen. Einbringen möchte ich meine Art, ein Problem von der Datenseite her aufzumachen.</w:t>
+      </w:r>
+    </w:p>
+    <w:p>
+      <w:pPr>
+        <w:spacing w:after="170" w:line="264"/>
+        <w:jc w:val="both"/>
+      </w:pPr>
+      <w:r>
+        <w:rPr>
+          <w:rFonts w:ascii="Calibri" w:cs="Calibri" w:eastAsia="Calibri" w:hAnsi="Calibri"/>
+          <w:sz w:val="22"/>
+          <w:szCs w:val="22"/>
+        </w:rPr>
+        <w:t xml:space="preserve">Was mich sonst ausmacht, liegt außerhalb des Fachs. Ich nehme Dinge selbst in die Hand: Meine sechs Praxisstationen bei EY habe ich alle eigenständig organisiert und bin dafür auf Menschen zugegangen, die ich nicht kannte. Wichtig ist mir ein Umfeld, in dem man miteinander auskommt, und deshalb liegt mir mein Ehrenamt am Herzen. Ich gehöre dem Vorstand der Sport Gemeinschaft Kirchen-Hausen mit 362 Mitgliedern an, führe die Kasse des örtlichen Jugendclubs und begleite im Angelverein etwa alle drei Wochen einen Jugendfischertag. Verlangen kann ich dort nichts, denn alle arbeiten freiwillig neben ihrem Beruf. Diese Ämter möchte ich während des Jahres in Cambridge weiterführen, was überwiegend aus der Ferne möglich ist. Und ich bin gern unter Menschen, brauche aber bewusst Zeit für mich. Die finde ich beim Angeln, in der Stille am Wasser. Eine längere solche Pause steht mir noch bevor: Ich werde vier Wochen allein mit der Angelrute durch Patagonien reisen.</w:t>
+      </w:r>
+    </w:p>
+    <w:p>
+      <w:pPr>
+        <w:spacing w:after="170" w:line="264"/>
+        <w:jc w:val="both"/>
+      </w:pPr>
+      <w:r>
+        <w:rPr>
+          <w:rFonts w:ascii="Calibri" w:cs="Calibri" w:eastAsia="Calibri" w:hAnsi="Calibri"/>
+          <w:sz w:val="22"/>
+          <w:szCs w:val="22"/>
+        </w:rPr>
+        <w:t xml:space="preserve">Mein Leitsatz ist, jeden Tag ein Stück besser zu werden als am Tag davor, fachlich wie als Mensch. Nach dem MPhil möchte ich an der Schnittstelle von Operations und digitaler Technologie arbeiten, zunächst beratend, später gern in einem Industrieunternehmen. Die Verfahren, um die es geht, gibt es längst. Ihre Einführung scheitert nach meiner Erfahrung seltener an der Technik als daran, dass niemand im Raum sitzt, der sie fachlich beurteilen kann. Dorthin will ich, und dafür brauche ich ein Jahr, in dem ich lerne, statt zu liefern.</w:t>
+      </w:r>
+    </w:p>
+    <w:p>
+      <w:pPr>
+        <w:spacing w:after="340" w:before="120"/>
+      </w:pPr>
+      <w:r>
+        <w:rPr>
+          <w:rFonts w:ascii="Calibri" w:cs="Calibri" w:eastAsia="Calibri" w:hAnsi="Calibri"/>
+          <w:sz w:val="22"/>
+          <w:szCs w:val="22"/>
+        </w:rPr>
+        <w:t xml:space="preserve">Mit freundlichen Grüßen</w:t>
       </w:r>
     </w:p>
     <w:p>
       <w:pPr>
         <w:spacing w:after="0" w:line="264"/>
-        <w:jc w:val="left"/>
-      </w:pPr>
-      <w:r>
-        <w:rPr>
-          <w:rFonts w:ascii="Calibri" w:cs="Calibri" w:eastAsia="Calibri" w:hAnsi="Calibri"/>
-          <w:sz w:val="22"/>
-          <w:szCs w:val="22"/>
-          <w:highlight w:val="yellow"/>
-          <w:highlightCs w:val="yellow"/>
-        </w:rPr>
-        <w:t xml:space="preserve">[Straße und Hausnummer]</w:t>
-      </w:r>
-    </w:p>
-    <w:p>
-      <w:pPr>
-        <w:spacing w:after="0" w:line="264"/>
-        <w:jc w:val="left"/>
-      </w:pPr>
-      <w:r>
-        <w:rPr>
-          <w:rFonts w:ascii="Calibri" w:cs="Calibri" w:eastAsia="Calibri" w:hAnsi="Calibri"/>
-          <w:sz w:val="22"/>
-          <w:szCs w:val="22"/>
-          <w:highlight w:val="yellow"/>
-          <w:highlightCs w:val="yellow"/>
-        </w:rPr>
-        <w:t xml:space="preserve">[Postleitzahl]</w:t>
-      </w:r>
-      <w:r>
-        <w:rPr>
-          <w:rFonts w:ascii="Calibri" w:cs="Calibri" w:eastAsia="Calibri" w:hAnsi="Calibri"/>
-          <w:sz w:val="22"/>
-          <w:szCs w:val="22"/>
-        </w:rPr>
-        <w:t xml:space="preserve"> Stuttgart</w:t>
-      </w:r>
-    </w:p>
-    <w:p>
-      <w:pPr>
-        <w:spacing w:after="0" w:line="264"/>
-        <w:jc w:val="left"/>
-      </w:pPr>
-      <w:r>
-        <w:rPr>
-          <w:rFonts w:ascii="Calibri" w:cs="Calibri" w:eastAsia="Calibri" w:hAnsi="Calibri"/>
-          <w:sz w:val="22"/>
-          <w:szCs w:val="22"/>
-        </w:rPr>
-        <w:t xml:space="preserve">tim.roeschkh@gmail.com</w:t>
-      </w:r>
-    </w:p>
-    <w:p>
-      <w:pPr>
-        <w:spacing w:after="360" w:line="264"/>
-        <w:jc w:val="left"/>
-      </w:pPr>
-      <w:r>
-        <w:rPr>
-          <w:rFonts w:ascii="Calibri" w:cs="Calibri" w:eastAsia="Calibri" w:hAnsi="Calibri"/>
-          <w:sz w:val="22"/>
-          <w:szCs w:val="22"/>
-        </w:rPr>
-        <w:t xml:space="preserve">+49 176 47299077</w:t>
-      </w:r>
-    </w:p>
-    <w:p>
-      <w:pPr>
-        <w:spacing w:after="360" w:line="264"/>
-        <w:jc w:val="right"/>
-      </w:pPr>
-      <w:r>
-        <w:rPr>
-          <w:rFonts w:ascii="Calibri" w:cs="Calibri" w:eastAsia="Calibri" w:hAnsi="Calibri"/>
-          <w:sz w:val="22"/>
-          <w:szCs w:val="22"/>
-        </w:rPr>
-        <w:t xml:space="preserve">Stuttgart, 21. September 2026</w:t>
-      </w:r>
-    </w:p>
-    <w:p>
-      <w:pPr>
-        <w:spacing w:after="300" w:line="264"/>
-        <w:jc w:val="both"/>
-      </w:pPr>
-      <w:r>
-        <w:rPr>
-          <w:rFonts w:ascii="Calibri" w:cs="Calibri" w:eastAsia="Calibri" w:hAnsi="Calibri"/>
-          <w:b/>
-          <w:bCs/>
-          <w:sz w:val="22"/>
-          <w:szCs w:val="22"/>
-        </w:rPr>
-        <w:t xml:space="preserve">Bewerbung um ein Stipendium im Programm „Stipendien für ein Masterstudium im Ausland“: MPhil in Industrial Systems, Manufacture and Management, Institute for Manufacturing, Department of Engineering, University of Cambridge, Studienbeginn Oktober 2027</w:t>
-      </w:r>
-    </w:p>
-    <w:p>
-      <w:pPr>
-        <w:spacing w:after="200" w:line="264"/>
-        <w:jc w:val="both"/>
-      </w:pPr>
-      <w:r>
-        <w:rPr>
-          <w:rFonts w:ascii="Calibri" w:cs="Calibri" w:eastAsia="Calibri" w:hAnsi="Calibri"/>
-          <w:sz w:val="22"/>
-          <w:szCs w:val="22"/>
-        </w:rPr>
-        <w:t xml:space="preserve">Sehr geehrte Damen und Herren,</w:t>
-      </w:r>
-    </w:p>
-    <w:p>
-      <w:pPr>
-        <w:spacing w:after="160" w:line="264"/>
-        <w:jc w:val="both"/>
-      </w:pPr>
-      <w:r>
-        <w:rPr>
-          <w:rFonts w:ascii="Calibri" w:cs="Calibri" w:eastAsia="Calibri" w:hAnsi="Calibri"/>
-          <w:sz w:val="22"/>
-          <w:szCs w:val="22"/>
-        </w:rPr>
-        <w:t xml:space="preserve">ich bewerbe mich um ein Stipendium für den MPhil in Industrial Systems, Manufacture and Management am Institute for Manufacturing der University of Cambridge, Studienbeginn Oktober 2027. Mein Bachelorstudium der Wirtschaftsinformatik an der Dualen Hochschule Baden-Württemberg schließe ich in diesem Monat ab; die Praxisphasen habe ich bei EY-Parthenon absolviert, überwiegend für industrielle Klienten. Drei Jahre lang habe ich Fertigungsunternehmen beurteilt, ohne je zu verstehen, wie in ihnen produziert wird. Was eine Anlage kostet und was sie einbringen muss, kann ich ausrechnen. Ob sie das Richtige tut, kann ich nicht beurteilen. Genau das will ich ändern.</w:t>
-      </w:r>
-    </w:p>
-    <w:p>
-      <w:pPr>
-        <w:spacing w:after="160" w:line="264"/>
-        <w:jc w:val="both"/>
-      </w:pPr>
-      <w:r>
-        <w:rPr>
-          <w:rFonts w:ascii="Calibri" w:cs="Calibri" w:eastAsia="Calibri" w:hAnsi="Calibri"/>
-          <w:sz w:val="22"/>
-          <w:szCs w:val="22"/>
-        </w:rPr>
-        <w:t xml:space="preserve">Wie ich zu diesem Vorhaben gekommen bin, zeigt sich an einer Sache am besten. In der Unternehmensprüfung gehört es zur Arbeit, jede Aussage eines Berichts gegen ihre Quelle zu halten. Das geschieht von Hand, oft spät abends, und die Konzentration lässt genau dann nach, wenn sie gebraucht wird. Ich habe angefangen, dafür ein Prüfverfahren zu bauen, zuerst neben dem Projekt her, später als Abschlussarbeit. Der schwierige Teil war nicht das Modell. Schwierig war die Frage, wann man einem maschinell erzeugten Urteil trauen darf, denn ein Werkzeug, das Fehler übersieht, ist schlechter als keines. Ich habe das Verfahren an 139 Aussagen eines vollständigen Berichts gegengeprüft; die Bewertungsgenauigkeit lag bei 94 Prozent. Damit habe ich drei Partner als Unterstützer gewonnen und es so weit gebracht, dass die Teams es heute in ihrem Arbeitsablauf verwenden. Die Frage dahinter hat mich nicht losgelassen. Sie wird schärfer, sobald eine Maschine nicht mehr einen Satz bewertet, sondern eine Anlage.</w:t>
-      </w:r>
-    </w:p>
-    <w:p>
-      <w:pPr>
-        <w:spacing w:after="160" w:line="264"/>
-        <w:jc w:val="both"/>
-      </w:pPr>
-      <w:r>
-        <w:rPr>
-          <w:rFonts w:ascii="Calibri" w:cs="Calibri" w:eastAsia="Calibri" w:hAnsi="Calibri"/>
-          <w:sz w:val="22"/>
-          <w:szCs w:val="22"/>
-        </w:rPr>
-        <w:t xml:space="preserve">Wie weit ich davon entfernt bin, habe ich in Böblingen gemerkt. Bei einer Werksführung von Mercedes-Benz standen wir vor einer Fertigung, die nach Angaben unserer Gastgeber zu rund 98 Prozent automatisiert ist. Linien liefen weitgehend ohne Menschen, und ich konnte kaum eine der Fragen beantworten, die mir dabei selbst kamen: warum ein Arbeitsschritt automatisiert ist und der nächste nicht, was die Taktzeit begrenzt, woran die Anlage erkennt, dass ein Teil in Ordnung ist. Bis dahin hatte ich solche Betriebe nur aus Berichten und Modellen gekannt. Im Anschluss habe ich einen Vortrag über Robotik in der Produktion gehalten und mich dafür zum ersten Mal ernsthaft damit befasst, wie diese Systeme aufgebaut sind und wo sie an Grenzen stoßen. Der Vortrag hat mein Interesse nicht beruhigt, sondern es überhaupt erst zu einer Frage gemacht, an der sich arbeiten lässt. In Singapur, wo ich einen Anwendungsfall zur vorausschauenden Instandhaltung vor Führungskräften vertreten habe, ist mir dieselbe Grenze ein zweites Mal begegnet.</w:t>
-      </w:r>
-    </w:p>
-    <w:p>
-      <w:pPr>
-        <w:spacing w:after="160" w:line="264"/>
-        <w:jc w:val="both"/>
-      </w:pPr>
-      <w:r>
-        <w:rPr>
-          <w:rFonts w:ascii="Calibri" w:cs="Calibri" w:eastAsia="Calibri" w:hAnsi="Calibri"/>
-          <w:sz w:val="22"/>
-          <w:szCs w:val="22"/>
-        </w:rPr>
-        <w:t xml:space="preserve">Der MPhil in Industrial Systems, Manufacture and Management führt zusammen, was ich bisher getrennt gelernt habe: Fertigungsverfahren, Operations und Lieferkette sowie die Modellierung von Fertigungsdaten stehen dort in einem einzigen Jahr nebeneinander, gekoppelt an Unternehmensprojekte und an eine eigene Forschungsarbeit. In Deutschland habe ich kein Programm gefunden, das mir beide Seiten in einem Jahr zusammenbringt. Am Institute for Manufacturing unterrichten Menschen, die selbst an der Automatisierung industrieller Abläufe forschen; meine Frage aus der Prüfarbeit hat in einem solchen Haus einen Ort. Mitbringen kann ich die Seite, die ich beherrsche: Daten, Modelle und die Übung, aus unvollständigem Material in kurzer Zeit eine belastbare Aussage zu formen und sie vor einem Führungsgremium zu vertreten.</w:t>
-      </w:r>
-    </w:p>
-    <w:p>
-      <w:pPr>
-        <w:spacing w:after="160" w:line="264"/>
-        <w:jc w:val="both"/>
-      </w:pPr>
-      <w:r>
-        <w:rPr>
-          <w:rFonts w:ascii="Calibri" w:cs="Calibri" w:eastAsia="Calibri" w:hAnsi="Calibri"/>
-          <w:sz w:val="22"/>
-          <w:szCs w:val="22"/>
-        </w:rPr>
-        <w:t xml:space="preserve">Was ich außerhalb des Fachs tue, hat mich auf andere Weise geprägt. Seit anderthalb Jahren gehöre ich dem Vorstand der Sport Gemeinschaft Kirchen-Hausen an, eines Vereins mit 362 Mitgliedern. Die Arbeit besteht selten aus großen Entscheidungen und fast immer aus Organisation: Übungsleiter und Termine zusammenbringen, Beschlüsse gegenüber Mitgliedern vertreten, die anderer Meinung sind, das meiste davon abends und am Wochenende. Verlangen kann ich dort nichts, denn niemand arbeitet für mich, alle arbeiten freiwillig neben ihrem Beruf. Für den Jugendclub am Ort führe ich außerdem die Kasse. Dazu kommt die Jugendarbeit in unserem Angelverein, wo ich etwa alle drei Wochen einen Jugendfischertag begleite. Kindern das Gewässer und den Umgang mit Tieren nahezubringen, ohne dass jemand die Geduld verliert, ist eine eigene Fähigkeit. Ich habe sie mir erarbeiten müssen.</w:t>
-      </w:r>
-    </w:p>
-    <w:p>
-      <w:pPr>
-        <w:spacing w:after="160" w:line="264"/>
-        <w:jc w:val="both"/>
-      </w:pPr>
-      <w:r>
-        <w:rPr>
-          <w:rFonts w:ascii="Calibri" w:cs="Calibri" w:eastAsia="Calibri" w:hAnsi="Calibri"/>
-          <w:sz w:val="22"/>
-          <w:szCs w:val="22"/>
-        </w:rPr>
-        <w:t xml:space="preserve">Nach dem MPhil möchte ich an der Schnittstelle von Operations und digitaler Technologie arbeiten, zunächst beratend, später gern in einem Industrieunternehmen. Die Verfahren, um die es geht, gibt es längst. Ihre Einführung scheitert nach meiner Erfahrung seltener an der Technik als daran, dass niemand im Raum sitzt, der sie fachlich beurteilen kann. Dorthin will ich. Der Zeitpunkt ist der richtige: Ich stehe am Anfang dieses Wegs. Dafür brauche ich ein Jahr, in dem ich lerne, statt zu liefern, und dieses Jahr möchte ich in Cambridge verbringen. Über Ihre Unterstützung würde ich mich sehr freuen.</w:t>
-      </w:r>
-    </w:p>
-    <w:p>
-      <w:pPr>
-        <w:spacing w:after="600" w:line="264"/>
-        <w:jc w:val="both"/>
-      </w:pPr>
-      <w:r>
-        <w:rPr>
-          <w:rFonts w:ascii="Calibri" w:cs="Calibri" w:eastAsia="Calibri" w:hAnsi="Calibri"/>
-          <w:sz w:val="22"/>
-          <w:szCs w:val="22"/>
-        </w:rPr>
-        <w:t xml:space="preserve">Mit freundlichen Grüßen</w:t>
-      </w:r>
-    </w:p>
-    <w:p>
-      <w:pPr>
-        <w:spacing w:after="0" w:line="264"/>
-        <w:jc w:val="both"/>
       </w:pPr>
       <w:r>
         <w:rPr>

</xml_diff>

<commit_message>
Close the three remaining gaps in the motivation letter
Adds the country argument, which DAAD asks for separately from the choice
of institution: the one-year British master compresses teaching, company
projects and a research dissertation into twelve months, a different shape
from the German two-year model.

Adds what the applicant hopes for scientifically, which DAAD asks about
twice and the letter answered only for the personal and professional
dimensions. Leaves open whether an academic path follows rather than
claiming a doctorate intention that does not exist. Trims the Böblingen
paragraph to hold the two-page limit.

Co-Authored-By: Claude Opus 5 <noreply@anthropic.com>
Claude-Session: https://claude.ai/code/session_018EEFYAf6pBJaMga5G9Xzjo
</commit_message>
<xml_diff>
--- a/DAAD_Bewerbung/04_Dokumente/Motivationsschreiben_Tim_Roesch.docx
+++ b/DAAD_Bewerbung/04_Dokumente/Motivationsschreiben_Tim_Roesch.docx
@@ -185,7 +185,7 @@
           <w:sz w:val="22"/>
           <w:szCs w:val="22"/>
         </w:rPr>
-        <w:t xml:space="preserve">Wie weit ich von der anderen Seite entfernt bin, habe ich in Böblingen gemerkt. Bei einer Werksführung von Mercedes-Benz standen wir vor einer Fertigung, die nach Angaben unserer Gastgeber zu rund 98 Prozent automatisiert ist. Ich konnte kaum eine der Fragen beantworten, die mir dabei selbst kamen: warum ein Arbeitsschritt automatisiert ist und der nächste nicht, was die Taktzeit begrenzt, woran eine Anlage erkennt, dass ein Teil in Ordnung ist. Im Anschluss habe ich einen Vortrag über Robotik in der Produktion gehalten und mich zum ersten Mal ernsthaft damit befasst, wie solche Systeme aufgebaut sind. In Singapur, wo ich vor Führungskräften einen Anwendungsfall zur vorausschauenden Instandhaltung vertreten habe, ist mir dieselbe Grenze ein zweites Mal begegnet. Den wirtschaftlichen Wert konnte ich beziffern. Das Verfahren dahinter nicht.</w:t>
+        <w:t xml:space="preserve">Wie weit ich von der anderen Seite entfernt bin, habe ich in Böblingen gemerkt. Bei einer Werksführung von Mercedes-Benz standen wir vor einer Fertigung, die nach Angaben unserer Gastgeber zu rund 98 Prozent automatisiert ist. Ich konnte kaum eine der Fragen beantworten, die mir dabei selbst kamen: warum ein Arbeitsschritt automatisiert ist und der nächste nicht, was die Taktzeit begrenzt, woran eine Anlage erkennt, dass ein Teil in Ordnung ist. Ein Vortrag über Robotik in der Produktion, den ich im Anschluss gehalten habe, hat daraus eine Frage gemacht, an der sich arbeiten lässt. In Singapur ist mir dieselbe Grenze ein zweites Mal begegnet: Den wirtschaftlichen Wert des Instandhaltungsfalls konnte ich beziffern, das Verfahren dahinter nicht.</w:t>
       </w:r>
     </w:p>
     <w:p>
@@ -200,6 +200,34 @@
           <w:szCs w:val="22"/>
         </w:rPr>
         <w:t xml:space="preserve">Der MPhil führt zusammen, was ich bisher getrennt gelernt habe: Fertigungsverfahren, Operations und Lieferkette sowie die Modellierung von Fertigungsdaten stehen dort in einem einzigen Jahr nebeneinander, gekoppelt an Unternehmensprojekte und eine eigene Forschungsarbeit. Ein Programm, das mir beide Seiten in einem Jahr zusammenbringt, habe ich in Deutschland nicht gefunden. Allgemeine Managementprogramme habe ich ebenfalls geprüft und verworfen; sie hätten mir hinzugefügt, was ich nach drei Jahren Beratung ohnehin kann, und die Lücke gelassen, die mich einschränkt.</w:t>
+      </w:r>
+    </w:p>
+    <w:p>
+      <w:pPr>
+        <w:spacing w:after="170" w:line="264"/>
+        <w:jc w:val="both"/>
+      </w:pPr>
+      <w:r>
+        <w:rPr>
+          <w:rFonts w:ascii="Calibri" w:cs="Calibri" w:eastAsia="Calibri" w:hAnsi="Calibri"/>
+          <w:sz w:val="22"/>
+          <w:szCs w:val="22"/>
+        </w:rPr>
+        <w:t xml:space="preserve">Dass es Großbritannien ist, liegt an der Bauform des Studiums. Ein einjähriger britischer Master verdichtet Lehre, Unternehmensprojekte und eine eigene Forschungsarbeit auf zwölf Monate, während das deutsche Zweijahresmodell diese Teile anders und über einen längeren Zeitraum verteilt. Ich suche keine zweite Grundausbildung, sondern eine Ergänzung, und dafür passt diese Form.</w:t>
+      </w:r>
+    </w:p>
+    <w:p>
+      <w:pPr>
+        <w:spacing w:after="170" w:line="264"/>
+        <w:jc w:val="both"/>
+      </w:pPr>
+      <w:r>
+        <w:rPr>
+          <w:rFonts w:ascii="Calibri" w:cs="Calibri" w:eastAsia="Calibri" w:hAnsi="Calibri"/>
+          <w:sz w:val="22"/>
+          <w:szCs w:val="22"/>
+        </w:rPr>
+        <w:t xml:space="preserve">Wissenschaftlich erhoffe ich mir mehr davon, als ich lange gedacht hätte. Das Arbeiten an meiner Abschlussarbeit hat mir Freude gemacht, und ich möchte darin besser werden: die Methoden genauer verstehen und sie auf diese Domäne anwenden. Beides zahlt aufeinander ein. Wer sauber untersucht, warum ein Verfahren trägt und wo es versagt, beurteilt es später auch in der Praxis besser. Ob daraus ein wissenschaftlicher Weg wird, möchte ich nach diesem Jahr entscheiden.</w:t>
       </w:r>
     </w:p>
     <w:p>

</xml_diff>